<commit_message>
ENGG 151 | Project 2 Progress Report 2
</commit_message>
<xml_diff>
--- a/ENGG 151/Project 2/DOCS N SUBS/Estacio_ProgressReport1.docx
+++ b/ENGG 151/Project 2/DOCS N SUBS/Estacio_ProgressReport1.docx
@@ -155,7 +155,7 @@
           <w:b/>
           <w:bCs/>
         </w:rPr>
-        <w:t>February 25</w:t>
+        <w:t>March 4</w:t>
       </w:r>
       <w:r>
         <w:rPr>
@@ -191,7 +191,23 @@
           <w:b/>
           <w:bCs/>
         </w:rPr>
-        <w:t xml:space="preserve">Progress Report 1 for Project </w:t>
+        <w:t>Progress Report</w:t>
+      </w:r>
+      <w:r>
+        <w:rPr>
+          <w:rFonts w:ascii="Liberation Serif" w:hAnsi="Liberation Serif"/>
+          <w:b/>
+          <w:bCs/>
+        </w:rPr>
+        <w:t xml:space="preserve"> 2</w:t>
+      </w:r>
+      <w:r>
+        <w:rPr>
+          <w:rFonts w:ascii="Liberation Serif" w:hAnsi="Liberation Serif"/>
+          <w:b/>
+          <w:bCs/>
+        </w:rPr>
+        <w:t xml:space="preserve"> for Project </w:t>
       </w:r>
       <w:r>
         <w:rPr>
@@ -253,119 +269,43 @@
         <w:rPr>
           <w:rFonts w:ascii="Liberation Serif" w:hAnsi="Liberation Serif"/>
         </w:rPr>
-        <w:t>February 25, 2026</w:t>
-      </w:r>
-      <w:r>
-        <w:rPr>
-          <w:rFonts w:ascii="Liberation Serif" w:hAnsi="Liberation Serif"/>
-        </w:rPr>
-        <w:t xml:space="preserve">, initial progress has been made </w:t>
-      </w:r>
-      <w:r>
-        <w:rPr>
-          <w:rFonts w:ascii="Liberation Serif" w:hAnsi="Liberation Serif"/>
-        </w:rPr>
-        <w:t xml:space="preserve">with </w:t>
-      </w:r>
-      <w:r>
-        <w:rPr>
-          <w:rFonts w:ascii="Liberation Serif" w:hAnsi="Liberation Serif"/>
-        </w:rPr>
-        <w:t>Niño Aloysius V. De Mesa</w:t>
-      </w:r>
-      <w:r>
-        <w:rPr>
-          <w:rFonts w:ascii="Liberation Serif" w:hAnsi="Liberation Serif"/>
-        </w:rPr>
-        <w:t xml:space="preserve"> and </w:t>
-      </w:r>
-      <w:r>
-        <w:rPr>
-          <w:rFonts w:ascii="Liberation Serif" w:hAnsi="Liberation Serif"/>
-        </w:rPr>
-        <w:t>Christian James S. Madariaga</w:t>
-      </w:r>
-      <w:r>
-        <w:rPr>
-          <w:rFonts w:ascii="Liberation Serif" w:hAnsi="Liberation Serif"/>
-        </w:rPr>
-        <w:t xml:space="preserve"> </w:t>
-      </w:r>
-      <w:r>
-        <w:rPr>
-          <w:rFonts w:ascii="Liberation Serif" w:hAnsi="Liberation Serif"/>
-        </w:rPr>
-        <w:t xml:space="preserve">to </w:t>
-      </w:r>
-      <w:r>
-        <w:rPr>
-          <w:rFonts w:ascii="Liberation Serif" w:hAnsi="Liberation Serif"/>
-        </w:rPr>
-        <w:t xml:space="preserve">implement the Discrete Fourier Transform calculations given the basic test signal. The results were printed to console and verified to be accurate. The functions for reading the signal file and verifying numbers as </w:t>
-      </w:r>
-      <w:r>
-        <w:rPr>
-          <w:rFonts w:ascii="Liberation Mono" w:hAnsi="Liberation Mono"/>
-          <w:sz w:val="20"/>
-          <w:szCs w:val="20"/>
-        </w:rPr>
-        <w:t>int</w:t>
-      </w:r>
-      <w:r>
-        <w:rPr>
-          <w:rFonts w:ascii="Liberation Serif" w:hAnsi="Liberation Serif"/>
-        </w:rPr>
-        <w:t xml:space="preserve"> or </w:t>
-      </w:r>
-      <w:r>
-        <w:rPr>
-          <w:rFonts w:ascii="Liberation Mono" w:hAnsi="Liberation Mono"/>
-          <w:sz w:val="20"/>
-          <w:szCs w:val="20"/>
-        </w:rPr>
-        <w:t>double</w:t>
-      </w:r>
-      <w:r>
-        <w:rPr>
-          <w:rFonts w:ascii="Liberation Serif" w:hAnsi="Liberation Serif"/>
-        </w:rPr>
-        <w:t xml:space="preserve"> numbers were integrated from Project 1. A function was written to convert input frequencies to their equivalent values in rad/s. Lastly, the function for calculating the Discrete Fourier Transform was programmed. It takes input parameters (the signal file name, the signal duration, the sampling rate, the starting and end frequencies, and the number of steps taken) and modifies arrays allocated in the main program for the real part, imaginary part, magnitude, and phase values of the calculations</w:t>
-      </w:r>
-      <w:r>
-        <w:rPr>
-          <w:rFonts w:ascii="Liberation Serif" w:hAnsi="Liberation Serif"/>
-        </w:rPr>
-        <w:t>.</w:t>
-      </w:r>
-      <w:r>
-        <w:rPr>
-          <w:rFonts w:ascii="Liberation Serif" w:hAnsi="Liberation Serif"/>
-        </w:rPr>
-        <w:t xml:space="preserve"> Results small enough or close enough to 0 are clamped to 0, specifically if the absolute value of the real part is less than</w:t>
-      </w:r>
-      <w:r>
-        <w:rPr>
-          <w:rFonts w:ascii="Liberation Serif" w:hAnsi="Liberation Serif"/>
-        </w:rPr>
-        <w:t xml:space="preserve"> </w:t>
-      </w:r>
-      <w:r>
-        <w:rPr>
-          <w:rFonts w:ascii="Liberation Serif" w:hAnsi="Liberation Serif"/>
-        </w:rPr>
-        <w:t xml:space="preserve">1E-08. </w:t>
-      </w:r>
-      <w:r>
-        <w:rPr>
-          <w:rFonts w:ascii="Liberation Serif" w:hAnsi="Liberation Serif"/>
-        </w:rPr>
-        <w:t>Further work</w:t>
-      </w:r>
-      <w:r>
-        <w:rPr>
-          <w:rFonts w:ascii="Liberation Serif" w:hAnsi="Liberation Serif"/>
-        </w:rPr>
-        <w:t xml:space="preserve"> includes accepting arguments when run from the command line, file output according to specifications, </w:t>
+        <w:t>March 4</w:t>
+      </w:r>
+      <w:r>
+        <w:rPr>
+          <w:rFonts w:ascii="Liberation Serif" w:hAnsi="Liberation Serif"/>
+        </w:rPr>
+        <w:t>, 2026</w:t>
+      </w:r>
+      <w:r>
+        <w:rPr>
+          <w:rFonts w:ascii="Liberation Serif" w:hAnsi="Liberation Serif"/>
+        </w:rPr>
+        <w:t xml:space="preserve">, </w:t>
+      </w:r>
+      <w:r>
+        <w:rPr>
+          <w:rFonts w:ascii="Liberation Serif" w:hAnsi="Liberation Serif"/>
+        </w:rPr>
+        <w:t>no additional progress has been made since the first progress report. As such, f</w:t>
+      </w:r>
+      <w:r>
+        <w:rPr>
+          <w:rFonts w:ascii="Liberation Serif" w:hAnsi="Liberation Serif"/>
+        </w:rPr>
+        <w:t xml:space="preserve">urther work </w:t>
+      </w:r>
+      <w:r>
+        <w:rPr>
+          <w:rFonts w:ascii="Liberation Serif" w:hAnsi="Liberation Serif"/>
+        </w:rPr>
+        <w:t xml:space="preserve">still </w:t>
+      </w:r>
+      <w:r>
+        <w:rPr>
+          <w:rFonts w:ascii="Liberation Serif" w:hAnsi="Liberation Serif"/>
+        </w:rPr>
+        <w:t xml:space="preserve">includes accepting arguments when run from the command line, file output according to specifications, </w:t>
       </w:r>
       <w:r>
         <w:rPr>
@@ -590,6 +530,7 @@
         <w:rPr>
           <w:noProof/>
         </w:rPr>
+        <w:lastRenderedPageBreak/>
         <w:drawing>
           <wp:inline distT="0" distB="0" distL="0" distR="0" wp14:anchorId="3505E814" wp14:editId="662A2CC6">
             <wp:extent cx="6071094" cy="1591294"/>
@@ -640,19 +581,11 @@
         </w:rPr>
         <w:t xml:space="preserve">compiler version – </w:t>
       </w:r>
-      <w:proofErr w:type="spellStart"/>
-      <w:r>
-        <w:rPr>
-          <w:rFonts w:ascii="Liberation Serif" w:hAnsi="Liberation Serif"/>
-        </w:rPr>
-        <w:t>gcc</w:t>
-      </w:r>
-      <w:proofErr w:type="spellEnd"/>
-      <w:r>
-        <w:rPr>
-          <w:rFonts w:ascii="Liberation Serif" w:hAnsi="Liberation Serif"/>
-        </w:rPr>
-        <w:t xml:space="preserve"> version 15.2.0 (Rev8, Built by MSYS2 project)</w:t>
+      <w:r>
+        <w:rPr>
+          <w:rFonts w:ascii="Liberation Serif" w:hAnsi="Liberation Serif"/>
+        </w:rPr>
+        <w:t>gcc version 15.2.0 (Rev8, Built by MSYS2 project)</w:t>
       </w:r>
     </w:p>
     <w:p>
@@ -814,21 +747,7 @@
         <w:rPr>
           <w:rFonts w:ascii="Liberation Serif" w:hAnsi="Liberation Serif"/>
         </w:rPr>
-        <w:t xml:space="preserve">IDE – Visual Studio Code </w:t>
-      </w:r>
-      <w:proofErr w:type="spellStart"/>
-      <w:r>
-        <w:rPr>
-          <w:rFonts w:ascii="Liberation Serif" w:hAnsi="Liberation Serif"/>
-        </w:rPr>
-        <w:t>ver</w:t>
-      </w:r>
-      <w:proofErr w:type="spellEnd"/>
-      <w:r>
-        <w:rPr>
-          <w:rFonts w:ascii="Liberation Serif" w:hAnsi="Liberation Serif"/>
-        </w:rPr>
-        <w:t xml:space="preserve"> 1.105.1</w:t>
+        <w:t>IDE – Visual Studio Code ver 1.105.1</w:t>
       </w:r>
     </w:p>
     <w:sectPr>
@@ -1633,6 +1552,7 @@
   <w:style w:type="character" w:default="1" w:styleId="DefaultParagraphFont">
     <w:name w:val="Default Paragraph Font"/>
     <w:uiPriority w:val="1"/>
+    <w:semiHidden/>
     <w:unhideWhenUsed/>
   </w:style>
   <w:style w:type="table" w:default="1" w:styleId="TableNormal">

</xml_diff>